<commit_message>
Add debug logging to trace QuestionCard flow
</commit_message>
<xml_diff>
--- a/Background/MVP_TESTER_GUIDE_Template.docx
+++ b/Background/MVP_TESTER_GUIDE_Template.docx
@@ -170,15 +170,21 @@
     </w:p>
     <w:p/>
     <w:p>
-      <w:pPr>
-        <w:rPr>
-          <w:szCs w:val="24"/>
-        </w:rPr>
-      </w:pPr>
       <w:r>
         <w:t>In this testing phase we are asking you to help us test the Product Strategy Development feature, as well as provide feedback on any/ all perceptions on the Product, Mission and experience in the platform.</w:t>
       </w:r>
     </w:p>
+    <w:p/>
+    <w:p>
+      <w:pPr>
+        <w:rPr>
+          <w:szCs w:val="24"/>
+        </w:rPr>
+      </w:pPr>
+      <w:r>
+        <w:t>This is designed for a company product strategy for startup to Enterprise, rather than an individual product team, which will come later.</w:t>
+      </w:r>
+    </w:p>
     <w:p>
       <w:pPr>
         <w:spacing w:after="80"/>
@@ -189,10 +195,38 @@
     </w:p>
     <w:p>
       <w:pPr>
+        <w:spacing w:after="80"/>
+        <w:rPr>
+          <w:szCs w:val="24"/>
+        </w:rPr>
+      </w:pPr>
+      <w:r>
+        <w:rPr>
+          <w:szCs w:val="24"/>
+        </w:rPr>
+        <w:t>We will use sessions recording software to analyse the usability of the platform, this only records what happens on the screen.</w:t>
+      </w:r>
+    </w:p>
+    <w:p>
+      <w:pPr>
+        <w:spacing w:after="80"/>
+        <w:rPr>
+          <w:szCs w:val="24"/>
+        </w:rPr>
+      </w:pPr>
+    </w:p>
+    <w:p>
+      <w:pPr>
         <w:pStyle w:val="Heading2"/>
       </w:pPr>
       <w:r>
-        <w:t>Section 1: Preparation (Complete Before the Session)</w:t>
+        <w:t xml:space="preserve">Section 1: Preparation (Complete Before </w:t>
+      </w:r>
+      <w:r>
+        <w:t>starting the Testing</w:t>
+      </w:r>
+      <w:r>
+        <w:t>)</w:t>
       </w:r>
     </w:p>
     <w:p>
@@ -209,7 +243,16 @@
           <w:color w:val="334155"/>
           <w:szCs w:val="24"/>
         </w:rPr>
-        <w:t>Please read this entire section and complete the steps below before our scheduled call.</w:t>
+        <w:t>Please read this entire section and complete the steps below</w:t>
+      </w:r>
+      <w:r>
+        <w:rPr>
+          <w:b/>
+          <w:bCs/>
+          <w:color w:val="334155"/>
+          <w:szCs w:val="24"/>
+        </w:rPr>
+        <w:t>. If you are open to a call post testing I would really like to hear some direct feedback on the product concept and user experience.</w:t>
       </w:r>
     </w:p>
     <w:p>
@@ -308,94 +351,7 @@
         <w:rPr>
           <w:color w:val="334155"/>
         </w:rPr>
-        <w:t>A fictional company — if you'd prefer, invent a company in an industry you understand (e.g. "a mid-sized fintech lender targeting SMEs")</w:t>
-      </w:r>
-    </w:p>
-    <w:p>
-      <w:pPr>
-        <w:spacing w:after="80"/>
-        <w:rPr>
-          <w:szCs w:val="24"/>
-        </w:rPr>
-      </w:pPr>
-    </w:p>
-    <w:p>
-      <w:pPr>
-        <w:spacing w:after="120"/>
-        <w:rPr>
-          <w:szCs w:val="24"/>
-        </w:rPr>
-      </w:pPr>
-      <w:r>
-        <w:rPr>
-          <w:color w:val="334155"/>
-          <w:szCs w:val="24"/>
-        </w:rPr>
-        <w:t>Whichever you choose, you should be able to speak to the company's products, customers, competitors, and strategic challenges.</w:t>
-      </w:r>
-    </w:p>
-    <w:p>
-      <w:pPr>
-        <w:spacing w:after="80"/>
-        <w:rPr>
-          <w:szCs w:val="24"/>
-        </w:rPr>
-      </w:pPr>
-    </w:p>
-    <w:p>
-      <w:pPr>
-        <w:pStyle w:val="Heading3"/>
-        <w:spacing w:before="240" w:after="120"/>
-      </w:pPr>
-      <w:r>
-        <w:rPr>
-          <w:b/>
-          <w:bCs/>
-          <w:color w:val="1A1F3A"/>
-          <w:sz w:val="22"/>
-          <w:szCs w:val="22"/>
-        </w:rPr>
-        <w:t>1.2 Gather Supporting Materials</w:t>
-      </w:r>
-    </w:p>
-    <w:p>
-      <w:pPr>
-        <w:spacing w:after="120"/>
-        <w:rPr>
-          <w:szCs w:val="24"/>
-        </w:rPr>
-      </w:pPr>
-      <w:r>
-        <w:rPr>
-          <w:color w:val="334155"/>
-          <w:szCs w:val="24"/>
-        </w:rPr>
-        <w:t>The platform will ask you to upload documents that describe the company's context and performance. Having these ready will make the session smoother and more realistic.</w:t>
-      </w:r>
-    </w:p>
-    <w:p>
-      <w:pPr>
-        <w:spacing w:after="80"/>
-        <w:rPr>
-          <w:szCs w:val="24"/>
-        </w:rPr>
-      </w:pPr>
-    </w:p>
-    <w:p>
-      <w:pPr>
-        <w:spacing w:after="120"/>
-        <w:rPr>
-          <w:szCs w:val="24"/>
-        </w:rPr>
-      </w:pPr>
-      <w:r>
-        <w:rPr>
-          <w:b/>
-          <w:bCs/>
-          <w:color w:val="334155"/>
-          <w:szCs w:val="24"/>
-        </w:rPr>
-        <w:t>Useful materials to have (any format — PDF, Word, web links):</w:t>
+        <w:t>A start up idea you have</w:t>
       </w:r>
     </w:p>
     <w:p>
@@ -411,7 +367,102 @@
         <w:rPr>
           <w:color w:val="334155"/>
         </w:rPr>
-        <w:t>Annual report or financial summary</w:t>
+        <w:t>A fictional company — if you'd prefer, invent a company in an industry you understand (e.g. "a mid-sized fintech lender targeting SMEs")</w:t>
+      </w:r>
+    </w:p>
+    <w:p>
+      <w:pPr>
+        <w:spacing w:after="80"/>
+        <w:rPr>
+          <w:szCs w:val="24"/>
+        </w:rPr>
+      </w:pPr>
+    </w:p>
+    <w:p>
+      <w:pPr>
+        <w:spacing w:after="120"/>
+        <w:rPr>
+          <w:szCs w:val="24"/>
+        </w:rPr>
+      </w:pPr>
+      <w:r>
+        <w:rPr>
+          <w:color w:val="334155"/>
+          <w:szCs w:val="24"/>
+        </w:rPr>
+        <w:lastRenderedPageBreak/>
+        <w:t>Whichever you choose, you should be able to speak to the company's products, customers, competitors, and strategic challenges.</w:t>
+      </w:r>
+      <w:r>
+        <w:rPr>
+          <w:color w:val="334155"/>
+          <w:szCs w:val="24"/>
+        </w:rPr>
+        <w:t xml:space="preserve"> It will help you assess the quality of the coaching and recommendations.</w:t>
+      </w:r>
+    </w:p>
+    <w:p>
+      <w:pPr>
+        <w:spacing w:after="80"/>
+        <w:rPr>
+          <w:szCs w:val="24"/>
+        </w:rPr>
+      </w:pPr>
+    </w:p>
+    <w:p>
+      <w:pPr>
+        <w:pStyle w:val="Heading3"/>
+        <w:spacing w:before="240" w:after="120"/>
+      </w:pPr>
+      <w:r>
+        <w:rPr>
+          <w:b/>
+          <w:bCs/>
+          <w:color w:val="1A1F3A"/>
+          <w:sz w:val="22"/>
+          <w:szCs w:val="22"/>
+        </w:rPr>
+        <w:t>1.2 Gather Supporting Materials</w:t>
+      </w:r>
+    </w:p>
+    <w:p>
+      <w:pPr>
+        <w:spacing w:after="120"/>
+        <w:rPr>
+          <w:szCs w:val="24"/>
+        </w:rPr>
+      </w:pPr>
+      <w:r>
+        <w:rPr>
+          <w:color w:val="334155"/>
+          <w:szCs w:val="24"/>
+        </w:rPr>
+        <w:t>The platform will ask you to upload documents that describe the company's context and performance. Having these ready will make the session smoother and more realistic.</w:t>
+      </w:r>
+    </w:p>
+    <w:p>
+      <w:pPr>
+        <w:spacing w:after="80"/>
+        <w:rPr>
+          <w:szCs w:val="24"/>
+        </w:rPr>
+      </w:pPr>
+    </w:p>
+    <w:p>
+      <w:pPr>
+        <w:spacing w:after="120"/>
+        <w:rPr>
+          <w:szCs w:val="24"/>
+        </w:rPr>
+      </w:pPr>
+      <w:r>
+        <w:rPr>
+          <w:b/>
+          <w:bCs/>
+          <w:color w:val="334155"/>
+          <w:szCs w:val="24"/>
+        </w:rPr>
+        <w:t>Useful materials to have (any format — PDF, Word, web links):</w:t>
       </w:r>
     </w:p>
     <w:p>
@@ -427,8 +478,7 @@
         <w:rPr>
           <w:color w:val="334155"/>
         </w:rPr>
-        <w:lastRenderedPageBreak/>
-        <w:t>Company strategy document or investor presentation</w:t>
+        <w:t>Annual report or financial summary</w:t>
       </w:r>
     </w:p>
     <w:p>
@@ -444,7 +494,7 @@
         <w:rPr>
           <w:color w:val="334155"/>
         </w:rPr>
-        <w:t>Product roadmap or product overview</w:t>
+        <w:t>Company strategy document or investor presentation</w:t>
       </w:r>
     </w:p>
     <w:p>
@@ -460,7 +510,7 @@
         <w:rPr>
           <w:color w:val="334155"/>
         </w:rPr>
-        <w:t>Market research or competitive analysis</w:t>
+        <w:t>Product roadmap or product overview</w:t>
       </w:r>
     </w:p>
     <w:p>
@@ -476,7 +526,7 @@
         <w:rPr>
           <w:color w:val="334155"/>
         </w:rPr>
-        <w:t>Customer research, personas, or survey results</w:t>
+        <w:t>Market research or competitive analysis</w:t>
       </w:r>
     </w:p>
     <w:p>
@@ -492,78 +542,7 @@
         <w:rPr>
           <w:color w:val="334155"/>
         </w:rPr>
-        <w:t>Press releases or recent news articles about the company</w:t>
-      </w:r>
-    </w:p>
-    <w:p>
-      <w:pPr>
-        <w:spacing w:after="80"/>
-        <w:rPr>
-          <w:szCs w:val="24"/>
-        </w:rPr>
-      </w:pPr>
-    </w:p>
-    <w:p>
-      <w:pPr>
-        <w:spacing w:after="120"/>
-        <w:rPr>
-          <w:szCs w:val="24"/>
-        </w:rPr>
-      </w:pPr>
-      <w:r>
-        <w:rPr>
-          <w:b/>
-          <w:bCs/>
-          <w:color w:val="334155"/>
-          <w:szCs w:val="24"/>
-        </w:rPr>
-        <w:t>Don't have these to hand? That's fine. You have two options:</w:t>
-      </w:r>
-    </w:p>
-    <w:p>
-      <w:pPr>
-        <w:spacing w:after="80"/>
-        <w:rPr>
-          <w:szCs w:val="24"/>
-        </w:rPr>
-      </w:pPr>
-    </w:p>
-    <w:p>
-      <w:pPr>
-        <w:spacing w:after="120"/>
-        <w:rPr>
-          <w:szCs w:val="24"/>
-        </w:rPr>
-      </w:pPr>
-      <w:r>
-        <w:rPr>
-          <w:color w:val="334155"/>
-          <w:szCs w:val="24"/>
-        </w:rPr>
-        <w:t>1. Use publicly available materials — most companies publish annual reports, investor decks, and press releases on their websites.</w:t>
-      </w:r>
-    </w:p>
-    <w:p>
-      <w:pPr>
-        <w:spacing w:after="80"/>
-        <w:rPr>
-          <w:szCs w:val="24"/>
-        </w:rPr>
-      </w:pPr>
-    </w:p>
-    <w:p>
-      <w:pPr>
-        <w:spacing w:after="120"/>
-        <w:rPr>
-          <w:szCs w:val="24"/>
-        </w:rPr>
-      </w:pPr>
-      <w:r>
-        <w:rPr>
-          <w:color w:val="334155"/>
-          <w:szCs w:val="24"/>
-        </w:rPr>
-        <w:t>2. Generate example documents using an AI tool — open ChatGPT or Claude (claude.ai) and ask it to create realistic example documents. For example:</w:t>
+        <w:t>Customer research, personas, or survey results</w:t>
       </w:r>
     </w:p>
     <w:p>
@@ -577,11 +556,103 @@
       </w:pPr>
       <w:r>
         <w:rPr>
-          <w:i/>
-          <w:iCs/>
-          <w:color w:val="334155"/>
-        </w:rPr>
-        <w:t>"Write a one-page executive summary of annual results for a mid-sized B2B SaaS company in the healthcare sector with £25m revenue"</w:t>
+          <w:color w:val="334155"/>
+        </w:rPr>
+        <w:t>Press releases or recent news articles about the company</w:t>
+      </w:r>
+    </w:p>
+    <w:p>
+      <w:pPr>
+        <w:spacing w:after="80"/>
+        <w:rPr>
+          <w:szCs w:val="24"/>
+        </w:rPr>
+      </w:pPr>
+    </w:p>
+    <w:p>
+      <w:pPr>
+        <w:shd w:val="clear" w:color="auto" w:fill="B3E5A1" w:themeFill="accent6" w:themeFillTint="66"/>
+        <w:spacing w:after="120"/>
+        <w:rPr>
+          <w:szCs w:val="24"/>
+        </w:rPr>
+      </w:pPr>
+      <w:r>
+        <w:rPr>
+          <w:b/>
+          <w:bCs/>
+          <w:color w:val="334155"/>
+          <w:szCs w:val="24"/>
+        </w:rPr>
+        <w:t>Don't have these to hand? That's fine. You have options:</w:t>
+      </w:r>
+    </w:p>
+    <w:p>
+      <w:pPr>
+        <w:pStyle w:val="ListParagraph"/>
+        <w:numPr>
+          <w:ilvl w:val="0"/>
+          <w:numId w:val="5"/>
+        </w:numPr>
+        <w:spacing w:after="120"/>
+        <w:rPr>
+          <w:color w:val="334155"/>
+          <w:szCs w:val="24"/>
+        </w:rPr>
+      </w:pPr>
+      <w:r>
+        <w:rPr>
+          <w:color w:val="334155"/>
+          <w:szCs w:val="24"/>
+        </w:rPr>
+        <w:t>Use publicly available materials — most companies publish annual reports, investor decks, and press releases on their websites.</w:t>
+      </w:r>
+    </w:p>
+    <w:p>
+      <w:pPr>
+        <w:pStyle w:val="ListParagraph"/>
+        <w:numPr>
+          <w:ilvl w:val="0"/>
+          <w:numId w:val="5"/>
+        </w:numPr>
+        <w:spacing w:after="120"/>
+        <w:rPr>
+          <w:szCs w:val="24"/>
+        </w:rPr>
+      </w:pPr>
+      <w:r>
+        <w:rPr>
+          <w:szCs w:val="24"/>
+        </w:rPr>
+        <w:t xml:space="preserve">Use the document finder in the Discovery section, where you can ask the ai coach to search using key words or </w:t>
+      </w:r>
+      <w:proofErr w:type="spellStart"/>
+      <w:r>
+        <w:rPr>
+          <w:szCs w:val="24"/>
+        </w:rPr>
+        <w:t>urls</w:t>
+      </w:r>
+      <w:proofErr w:type="spellEnd"/>
+    </w:p>
+    <w:p>
+      <w:pPr>
+        <w:pStyle w:val="ListParagraph"/>
+        <w:numPr>
+          <w:ilvl w:val="0"/>
+          <w:numId w:val="5"/>
+        </w:numPr>
+        <w:spacing w:after="120"/>
+        <w:rPr>
+          <w:szCs w:val="24"/>
+        </w:rPr>
+      </w:pPr>
+      <w:r>
+        <w:rPr>
+          <w:color w:val="334155"/>
+          <w:szCs w:val="24"/>
+        </w:rPr>
+        <w:t xml:space="preserve"> Generate example documents using an AI tool — open ChatGPT or Claude (claude.ai) and ask it to create realistic example documents. For example:</w:t>
       </w:r>
     </w:p>
     <w:p>
@@ -599,7 +670,7 @@
           <w:iCs/>
           <w:color w:val="334155"/>
         </w:rPr>
-        <w:t>"Create a brief competitive landscape overview for a fintech company competing in SME lending in the UK"</w:t>
+        <w:t>"Write a one-page executive summary of annual results for a mid-sized B2B SaaS company in the healthcare sector with £25m revenue"</w:t>
       </w:r>
     </w:p>
     <w:p>
@@ -617,79 +688,7 @@
           <w:iCs/>
           <w:color w:val="334155"/>
         </w:rPr>
-        <w:t>"Write a product strategy summary for a logistics technology company focused on last-mile delivery"</w:t>
-      </w:r>
-    </w:p>
-    <w:p>
-      <w:pPr>
-        <w:spacing w:after="80"/>
-        <w:rPr>
-          <w:szCs w:val="24"/>
-        </w:rPr>
-      </w:pPr>
-    </w:p>
-    <w:p>
-      <w:pPr>
-        <w:spacing w:after="120"/>
-        <w:rPr>
-          <w:szCs w:val="24"/>
-        </w:rPr>
-      </w:pPr>
-      <w:r>
-        <w:rPr>
-          <w:color w:val="334155"/>
-          <w:szCs w:val="24"/>
-        </w:rPr>
-        <w:t>Save each response as a PDF or Word document so you can upload it during the session.</w:t>
-      </w:r>
-    </w:p>
-    <w:p>
-      <w:pPr>
-        <w:spacing w:after="80"/>
-        <w:rPr>
-          <w:szCs w:val="24"/>
-        </w:rPr>
-      </w:pPr>
-    </w:p>
-    <w:p>
-      <w:pPr>
-        <w:spacing w:after="120"/>
-        <w:rPr>
-          <w:szCs w:val="24"/>
-        </w:rPr>
-      </w:pPr>
-      <w:r>
-        <w:rPr>
-          <w:b/>
-          <w:bCs/>
-          <w:color w:val="334155"/>
-          <w:szCs w:val="24"/>
-        </w:rPr>
-        <w:t>Aim to have 2–3 documents ready. One is the minimum — the more context you provide, the more tailored the coaching experience will be.</w:t>
-      </w:r>
-    </w:p>
-    <w:p>
-      <w:pPr>
-        <w:spacing w:after="80"/>
-        <w:rPr>
-          <w:szCs w:val="24"/>
-        </w:rPr>
-      </w:pPr>
-    </w:p>
-    <w:p>
-      <w:pPr>
-        <w:pStyle w:val="Heading3"/>
-        <w:spacing w:before="240" w:after="120"/>
-      </w:pPr>
-      <w:r>
-        <w:rPr>
-          <w:b/>
-          <w:bCs/>
-          <w:color w:val="1A1F3A"/>
-          <w:sz w:val="22"/>
-          <w:szCs w:val="22"/>
-        </w:rPr>
-        <w:t>1.3 Set Up Your Environment</w:t>
+        <w:t>"Create a brief competitive landscape overview for a fintech company competing in SME lending in the UK"</w:t>
       </w:r>
     </w:p>
     <w:p>
@@ -703,9 +702,336 @@
       </w:pPr>
       <w:r>
         <w:rPr>
-          <w:color w:val="334155"/>
-        </w:rPr>
-        <w:t>Use a laptop or desktop computer with a modern browser (Chrome, Edge, Safari, or Firefox)</w:t>
+          <w:i/>
+          <w:iCs/>
+          <w:color w:val="334155"/>
+        </w:rPr>
+        <w:t>"Write a product strategy summary for a logistics technology company focused on last-mile delivery"</w:t>
+      </w:r>
+    </w:p>
+    <w:p>
+      <w:pPr>
+        <w:spacing w:after="80"/>
+        <w:rPr>
+          <w:szCs w:val="24"/>
+        </w:rPr>
+      </w:pPr>
+    </w:p>
+    <w:p>
+      <w:pPr>
+        <w:spacing w:after="80"/>
+        <w:rPr>
+          <w:szCs w:val="24"/>
+        </w:rPr>
+      </w:pPr>
+    </w:p>
+    <w:p>
+      <w:pPr>
+        <w:spacing w:after="80"/>
+        <w:rPr>
+          <w:szCs w:val="24"/>
+        </w:rPr>
+      </w:pPr>
+      <w:r>
+        <w:rPr>
+          <w:color w:val="334155"/>
+          <w:szCs w:val="24"/>
+        </w:rPr>
+        <w:t>Save each response as a PDF or Word document so you can upload it during the session.</w:t>
+      </w:r>
+    </w:p>
+    <w:p>
+      <w:pPr>
+        <w:spacing w:after="80"/>
+        <w:rPr>
+          <w:szCs w:val="24"/>
+        </w:rPr>
+      </w:pPr>
+    </w:p>
+    <w:p>
+      <w:pPr>
+        <w:spacing w:after="80"/>
+        <w:rPr>
+          <w:szCs w:val="24"/>
+        </w:rPr>
+      </w:pPr>
+      <w:r>
+        <w:rPr>
+          <w:szCs w:val="24"/>
+        </w:rPr>
+        <w:t>If you want guidance on a longer prompt. Here is one I created for a fictional company to follow the test the platform myself. You don’t need to write this much, but it might help.</w:t>
+      </w:r>
+    </w:p>
+    <w:p>
+      <w:pPr>
+        <w:spacing w:after="80"/>
+        <w:rPr>
+          <w:i/>
+          <w:iCs/>
+          <w:szCs w:val="24"/>
+        </w:rPr>
+      </w:pPr>
+      <w:r>
+        <w:rPr>
+          <w:i/>
+          <w:iCs/>
+          <w:szCs w:val="24"/>
+        </w:rPr>
+        <w:t>“</w:t>
+      </w:r>
+      <w:r>
+        <w:rPr>
+          <w:i/>
+          <w:iCs/>
+          <w:szCs w:val="24"/>
+        </w:rPr>
+        <w:t xml:space="preserve">The </w:t>
+      </w:r>
+      <w:proofErr w:type="spellStart"/>
+      <w:r>
+        <w:rPr>
+          <w:i/>
+          <w:iCs/>
+          <w:szCs w:val="24"/>
+        </w:rPr>
+        <w:t>Lochee</w:t>
+      </w:r>
+      <w:proofErr w:type="spellEnd"/>
+      <w:r>
+        <w:rPr>
+          <w:i/>
+          <w:iCs/>
+          <w:szCs w:val="24"/>
+        </w:rPr>
+        <w:t xml:space="preserve"> Investment Company (LIC) is a start-up at pre-seed stage. They specialise in digital financial planning, aiming to solve the UK Financial advice gap through subscription a based product and platform that helps those who cannot access advice (afford or knowledge), those who do not have enough assets for f2f IFA service, or those who do not value the current advice offering. LIC are creating a greenfield modern advice and planning platform that supports, guides and coaches you through your financial life: financial health, long term goals, planning and pro-active coaching throughout all stages. </w:t>
+      </w:r>
+    </w:p>
+    <w:p>
+      <w:pPr>
+        <w:spacing w:after="80"/>
+        <w:rPr>
+          <w:i/>
+          <w:iCs/>
+          <w:szCs w:val="24"/>
+        </w:rPr>
+      </w:pPr>
+    </w:p>
+    <w:p>
+      <w:pPr>
+        <w:spacing w:after="80"/>
+        <w:rPr>
+          <w:i/>
+          <w:iCs/>
+          <w:szCs w:val="24"/>
+        </w:rPr>
+      </w:pPr>
+      <w:r>
+        <w:rPr>
+          <w:i/>
+          <w:iCs/>
+          <w:szCs w:val="24"/>
+        </w:rPr>
+        <w:t xml:space="preserve">LIC uses Open data, from banking, consumer tech, investment, insurance and public data to complement the coaching interaction and through the use of data and insights, helps you plan, grow and be aware of your financial future with confidence and protection. I want you to </w:t>
+      </w:r>
+      <w:r>
+        <w:rPr>
+          <w:i/>
+          <w:iCs/>
+          <w:szCs w:val="24"/>
+        </w:rPr>
+        <w:lastRenderedPageBreak/>
+        <w:t xml:space="preserve">create a sample pitch pack for the </w:t>
+      </w:r>
+      <w:proofErr w:type="spellStart"/>
+      <w:r>
+        <w:rPr>
+          <w:i/>
+          <w:iCs/>
+          <w:szCs w:val="24"/>
+        </w:rPr>
+        <w:t>Lochee</w:t>
+      </w:r>
+      <w:proofErr w:type="spellEnd"/>
+      <w:r>
+        <w:rPr>
+          <w:i/>
+          <w:iCs/>
+          <w:szCs w:val="24"/>
+        </w:rPr>
+        <w:t xml:space="preserve"> Investment Company, you should use the branding in the Logo design chat in this folder. Search for content/ back ground on targeted support, </w:t>
+      </w:r>
+      <w:proofErr w:type="spellStart"/>
+      <w:r>
+        <w:rPr>
+          <w:i/>
+          <w:iCs/>
+          <w:szCs w:val="24"/>
+        </w:rPr>
+        <w:t>uk</w:t>
+      </w:r>
+      <w:proofErr w:type="spellEnd"/>
+      <w:r>
+        <w:rPr>
+          <w:i/>
+          <w:iCs/>
+          <w:szCs w:val="24"/>
+        </w:rPr>
+        <w:t xml:space="preserve"> advice gap and generational wealth transfer using sources such as: </w:t>
+      </w:r>
+      <w:proofErr w:type="spellStart"/>
+      <w:r>
+        <w:rPr>
+          <w:i/>
+          <w:iCs/>
+          <w:szCs w:val="24"/>
+        </w:rPr>
+        <w:t>Langcat</w:t>
+      </w:r>
+      <w:proofErr w:type="spellEnd"/>
+      <w:r>
+        <w:rPr>
+          <w:i/>
+          <w:iCs/>
+          <w:szCs w:val="24"/>
+        </w:rPr>
+        <w:t xml:space="preserve">, Next Wealth, FTRC, Ian Mckenna, FT Adviser, Investment Trends, The Times, Citywire, </w:t>
+      </w:r>
+      <w:proofErr w:type="spellStart"/>
+      <w:r>
+        <w:rPr>
+          <w:i/>
+          <w:iCs/>
+          <w:szCs w:val="24"/>
+        </w:rPr>
+        <w:t>Proffesional</w:t>
+      </w:r>
+      <w:proofErr w:type="spellEnd"/>
+      <w:r>
+        <w:rPr>
+          <w:i/>
+          <w:iCs/>
+          <w:szCs w:val="24"/>
+        </w:rPr>
+        <w:t xml:space="preserve"> Adviser, FCA, FT and wider). </w:t>
+      </w:r>
+    </w:p>
+    <w:p>
+      <w:pPr>
+        <w:spacing w:after="80"/>
+        <w:rPr>
+          <w:i/>
+          <w:iCs/>
+          <w:szCs w:val="24"/>
+        </w:rPr>
+      </w:pPr>
+      <w:r>
+        <w:rPr>
+          <w:i/>
+          <w:iCs/>
+          <w:szCs w:val="24"/>
+        </w:rPr>
+        <w:t>For the USP/ IP in the product market fit, please propose a winning platform which combines personalisation in risk, life stage, desires, occupation etc, with market leading AI coaching interface, behaviour and financial goals planning journeys and cost/ charging which is affordable and aligns with the client outcomes (often a challenge of investment companies, misaligned objectives). Also propose on how this will engage the different personas who do not/ cannot engage with Financial advice. I know I have not given all the answers to create this, I want you to use the sources proposed and wider and create a pitch which will require creativity from you.</w:t>
+      </w:r>
+      <w:r>
+        <w:rPr>
+          <w:i/>
+          <w:iCs/>
+          <w:szCs w:val="24"/>
+        </w:rPr>
+        <w:t>”</w:t>
+      </w:r>
+    </w:p>
+    <w:p>
+      <w:pPr>
+        <w:spacing w:after="120"/>
+        <w:rPr>
+          <w:szCs w:val="24"/>
+        </w:rPr>
+      </w:pPr>
+    </w:p>
+    <w:p>
+      <w:pPr>
+        <w:spacing w:after="80"/>
+        <w:rPr>
+          <w:szCs w:val="24"/>
+        </w:rPr>
+      </w:pPr>
+    </w:p>
+    <w:p>
+      <w:pPr>
+        <w:spacing w:after="120"/>
+        <w:rPr>
+          <w:szCs w:val="24"/>
+        </w:rPr>
+      </w:pPr>
+      <w:r>
+        <w:rPr>
+          <w:b/>
+          <w:bCs/>
+          <w:color w:val="334155"/>
+          <w:szCs w:val="24"/>
+        </w:rPr>
+        <w:t xml:space="preserve">Aim to have </w:t>
+      </w:r>
+      <w:r>
+        <w:rPr>
+          <w:b/>
+          <w:bCs/>
+          <w:color w:val="334155"/>
+          <w:szCs w:val="24"/>
+        </w:rPr>
+        <w:t xml:space="preserve">3 </w:t>
+      </w:r>
+      <w:r>
+        <w:rPr>
+          <w:b/>
+          <w:bCs/>
+          <w:color w:val="334155"/>
+          <w:szCs w:val="24"/>
+        </w:rPr>
+        <w:t>documents</w:t>
+      </w:r>
+      <w:r>
+        <w:rPr>
+          <w:b/>
+          <w:bCs/>
+          <w:color w:val="334155"/>
+          <w:szCs w:val="24"/>
+        </w:rPr>
+        <w:t>+ ready.</w:t>
+      </w:r>
+      <w:r>
+        <w:rPr>
+          <w:b/>
+          <w:bCs/>
+          <w:color w:val="334155"/>
+          <w:szCs w:val="24"/>
+        </w:rPr>
+        <w:t xml:space="preserve"> One is the minimum — the more context you provide, the more tailored the coaching experience will be.</w:t>
+      </w:r>
+    </w:p>
+    <w:p>
+      <w:pPr>
+        <w:spacing w:after="80"/>
+        <w:rPr>
+          <w:szCs w:val="24"/>
+        </w:rPr>
+      </w:pPr>
+    </w:p>
+    <w:p>
+      <w:pPr>
+        <w:pStyle w:val="Heading3"/>
+        <w:spacing w:before="240" w:after="120"/>
+      </w:pPr>
+      <w:r>
+        <w:rPr>
+          <w:b/>
+          <w:bCs/>
+          <w:color w:val="1A1F3A"/>
+          <w:sz w:val="22"/>
+          <w:szCs w:val="22"/>
+        </w:rPr>
+        <w:t>1.3 Set Up Your Environment</w:t>
       </w:r>
     </w:p>
     <w:p>
@@ -721,7 +1047,7 @@
         <w:rPr>
           <w:color w:val="334155"/>
         </w:rPr>
-        <w:t>Have your documents saved somewhere accessible on your computer</w:t>
+        <w:t>Use a laptop or desktop computer with a modern browser (Chrome, Edge, Safari, or Firefox)</w:t>
       </w:r>
     </w:p>
     <w:p>
@@ -737,7 +1063,7 @@
         <w:rPr>
           <w:color w:val="334155"/>
         </w:rPr>
-        <w:t>Close other tabs and applications to minimise distractions</w:t>
+        <w:t>Have your documents saved somewhere accessible on your computer</w:t>
       </w:r>
     </w:p>
     <w:p>
@@ -753,7 +1079,7 @@
         <w:rPr>
           <w:color w:val="334155"/>
         </w:rPr>
-        <w:t>Make sure you can share your screen on the video call</w:t>
+        <w:t>Close other tabs and applications to minimise distractions</w:t>
       </w:r>
     </w:p>
     <w:p>
@@ -813,6 +1139,273 @@
           <w:szCs w:val="24"/>
         </w:rPr>
         <w:t>If you have feedback on a section, part of a journey can you take a screenshot and add to this pack with a  description of the issue/ or any feedback.</w:t>
+      </w:r>
+      <w:r>
+        <w:rPr>
+          <w:b/>
+          <w:bCs/>
+          <w:color w:val="334155"/>
+          <w:szCs w:val="24"/>
+        </w:rPr>
+        <w:t xml:space="preserve"> (good, bad, confusing?)</w:t>
+      </w:r>
+    </w:p>
+    <w:p>
+      <w:pPr>
+        <w:spacing w:after="80"/>
+        <w:rPr>
+          <w:szCs w:val="24"/>
+        </w:rPr>
+      </w:pPr>
+    </w:p>
+    <w:p>
+      <w:pPr>
+        <w:spacing w:after="80"/>
+        <w:rPr>
+          <w:b/>
+          <w:bCs/>
+          <w:i/>
+          <w:iCs/>
+          <w:szCs w:val="24"/>
+        </w:rPr>
+      </w:pPr>
+    </w:p>
+    <w:p>
+      <w:pPr>
+        <w:rPr>
+          <w:b/>
+          <w:bCs/>
+          <w:i/>
+          <w:iCs/>
+          <w:szCs w:val="24"/>
+        </w:rPr>
+      </w:pPr>
+      <w:r>
+        <w:rPr>
+          <w:b/>
+          <w:bCs/>
+          <w:i/>
+          <w:iCs/>
+          <w:szCs w:val="24"/>
+        </w:rPr>
+        <w:br w:type="page"/>
+      </w:r>
+    </w:p>
+    <w:p>
+      <w:pPr>
+        <w:pStyle w:val="Strong1"/>
+        <w:rPr>
+          <w:i/>
+          <w:iCs/>
+        </w:rPr>
+      </w:pPr>
+      <w:r>
+        <w:rPr>
+          <w:i/>
+          <w:iCs/>
+          <w:highlight w:val="red"/>
+        </w:rPr>
+        <w:lastRenderedPageBreak/>
+        <w:t>Refresh</w:t>
+      </w:r>
+      <w:r>
+        <w:rPr>
+          <w:i/>
+          <w:iCs/>
+          <w:highlight w:val="red"/>
+        </w:rPr>
+        <w:t xml:space="preserve"> Issues</w:t>
+      </w:r>
+    </w:p>
+    <w:p>
+      <w:pPr>
+        <w:spacing w:after="80"/>
+        <w:rPr>
+          <w:szCs w:val="24"/>
+        </w:rPr>
+      </w:pPr>
+      <w:r>
+        <w:rPr>
+          <w:szCs w:val="24"/>
+        </w:rPr>
+        <w:t>There is one known issue on page rendering. If the first load of a page renders incorrectly. Please refresh the browser page this should fix it. (as shown below)</w:t>
+      </w:r>
+    </w:p>
+    <w:p>
+      <w:pPr>
+        <w:spacing w:after="80"/>
+        <w:rPr>
+          <w:szCs w:val="24"/>
+        </w:rPr>
+      </w:pPr>
+      <w:r>
+        <w:rPr>
+          <w:szCs w:val="24"/>
+        </w:rPr>
+        <w:drawing>
+          <wp:inline distT="0" distB="0" distL="0" distR="0" wp14:anchorId="6A85B591" wp14:editId="79900ECE">
+            <wp:extent cx="2032959" cy="1799590"/>
+            <wp:effectExtent l="0" t="0" r="5715" b="0"/>
+            <wp:docPr id="1948288117" name="Picture 1" descr="A screenshot of a login form&#10;&#10;AI-generated content may be incorrect."/>
+            <wp:cNvGraphicFramePr>
+              <a:graphicFrameLocks xmlns:a="http://schemas.openxmlformats.org/drawingml/2006/main" noChangeAspect="1"/>
+            </wp:cNvGraphicFramePr>
+            <a:graphic xmlns:a="http://schemas.openxmlformats.org/drawingml/2006/main">
+              <a:graphicData uri="http://schemas.openxmlformats.org/drawingml/2006/picture">
+                <pic:pic xmlns:pic="http://schemas.openxmlformats.org/drawingml/2006/picture">
+                  <pic:nvPicPr>
+                    <pic:cNvPr id="1948288117" name="Picture 1" descr="A screenshot of a login form&#10;&#10;AI-generated content may be incorrect."/>
+                    <pic:cNvPicPr/>
+                  </pic:nvPicPr>
+                  <pic:blipFill rotWithShape="1">
+                    <a:blip r:embed="rId6"/>
+                    <a:srcRect l="9848" r="10826"/>
+                    <a:stretch>
+                      <a:fillRect/>
+                    </a:stretch>
+                  </pic:blipFill>
+                  <pic:spPr bwMode="auto">
+                    <a:xfrm>
+                      <a:off x="0" y="0"/>
+                      <a:ext cx="2040580" cy="1806336"/>
+                    </a:xfrm>
+                    <a:prstGeom prst="rect">
+                      <a:avLst/>
+                    </a:prstGeom>
+                    <a:ln>
+                      <a:noFill/>
+                    </a:ln>
+                    <a:extLst>
+                      <a:ext uri="{53640926-AAD7-44D8-BBD7-CCE9431645EC}">
+                        <a14:shadowObscured xmlns:a14="http://schemas.microsoft.com/office/drawing/2010/main"/>
+                      </a:ext>
+                    </a:extLst>
+                  </pic:spPr>
+                </pic:pic>
+              </a:graphicData>
+            </a:graphic>
+          </wp:inline>
+        </w:drawing>
+      </w:r>
+      <w:r>
+        <w:rPr>
+          <w:szCs w:val="24"/>
+        </w:rPr>
+        <w:t xml:space="preserve">   vs   </w:t>
+      </w:r>
+      <w:r>
+        <w:rPr>
+          <w:szCs w:val="24"/>
+        </w:rPr>
+        <w:drawing>
+          <wp:inline distT="0" distB="0" distL="0" distR="0" wp14:anchorId="56B977DD" wp14:editId="37F9B807">
+            <wp:extent cx="1535480" cy="2091324"/>
+            <wp:effectExtent l="0" t="0" r="7620" b="4445"/>
+            <wp:docPr id="994063384" name="Picture 1" descr="A screenshot of a login form&#10;&#10;AI-generated content may be incorrect."/>
+            <wp:cNvGraphicFramePr>
+              <a:graphicFrameLocks xmlns:a="http://schemas.openxmlformats.org/drawingml/2006/main" noChangeAspect="1"/>
+            </wp:cNvGraphicFramePr>
+            <a:graphic xmlns:a="http://schemas.openxmlformats.org/drawingml/2006/main">
+              <a:graphicData uri="http://schemas.openxmlformats.org/drawingml/2006/picture">
+                <pic:pic xmlns:pic="http://schemas.openxmlformats.org/drawingml/2006/picture">
+                  <pic:nvPicPr>
+                    <pic:cNvPr id="994063384" name="Picture 1" descr="A screenshot of a login form&#10;&#10;AI-generated content may be incorrect."/>
+                    <pic:cNvPicPr/>
+                  </pic:nvPicPr>
+                  <pic:blipFill>
+                    <a:blip r:embed="rId7"/>
+                    <a:stretch>
+                      <a:fillRect/>
+                    </a:stretch>
+                  </pic:blipFill>
+                  <pic:spPr>
+                    <a:xfrm>
+                      <a:off x="0" y="0"/>
+                      <a:ext cx="1550159" cy="2111317"/>
+                    </a:xfrm>
+                    <a:prstGeom prst="rect">
+                      <a:avLst/>
+                    </a:prstGeom>
+                  </pic:spPr>
+                </pic:pic>
+              </a:graphicData>
+            </a:graphic>
+          </wp:inline>
+        </w:drawing>
+      </w:r>
+    </w:p>
+    <w:p>
+      <w:pPr>
+        <w:spacing w:after="80"/>
+        <w:rPr>
+          <w:szCs w:val="24"/>
+        </w:rPr>
+      </w:pPr>
+    </w:p>
+    <w:p>
+      <w:pPr>
+        <w:spacing w:after="80"/>
+        <w:rPr>
+          <w:b/>
+          <w:bCs/>
+          <w:szCs w:val="24"/>
+        </w:rPr>
+      </w:pPr>
+      <w:r>
+        <w:rPr>
+          <w:b/>
+          <w:bCs/>
+          <w:szCs w:val="24"/>
+        </w:rPr>
+        <w:t>And another example</w:t>
+      </w:r>
+    </w:p>
+    <w:p>
+      <w:pPr>
+        <w:spacing w:after="80"/>
+        <w:rPr>
+          <w:szCs w:val="24"/>
+        </w:rPr>
+      </w:pPr>
+      <w:r>
+        <w:rPr>
+          <w:szCs w:val="24"/>
+        </w:rPr>
+        <w:drawing>
+          <wp:inline distT="0" distB="0" distL="0" distR="0" wp14:anchorId="18B2BD29" wp14:editId="0290BD7B">
+            <wp:extent cx="3633787" cy="1419130"/>
+            <wp:effectExtent l="0" t="0" r="5080" b="0"/>
+            <wp:docPr id="1722144325" name="Picture 1" descr="A screenshot of a chat&#10;&#10;AI-generated content may be incorrect."/>
+            <wp:cNvGraphicFramePr>
+              <a:graphicFrameLocks xmlns:a="http://schemas.openxmlformats.org/drawingml/2006/main" noChangeAspect="1"/>
+            </wp:cNvGraphicFramePr>
+            <a:graphic xmlns:a="http://schemas.openxmlformats.org/drawingml/2006/main">
+              <a:graphicData uri="http://schemas.openxmlformats.org/drawingml/2006/picture">
+                <pic:pic xmlns:pic="http://schemas.openxmlformats.org/drawingml/2006/picture">
+                  <pic:nvPicPr>
+                    <pic:cNvPr id="1722144325" name="Picture 1" descr="A screenshot of a chat&#10;&#10;AI-generated content may be incorrect."/>
+                    <pic:cNvPicPr/>
+                  </pic:nvPicPr>
+                  <pic:blipFill>
+                    <a:blip r:embed="rId8"/>
+                    <a:stretch>
+                      <a:fillRect/>
+                    </a:stretch>
+                  </pic:blipFill>
+                  <pic:spPr>
+                    <a:xfrm>
+                      <a:off x="0" y="0"/>
+                      <a:ext cx="3656167" cy="1427870"/>
+                    </a:xfrm>
+                    <a:prstGeom prst="rect">
+                      <a:avLst/>
+                    </a:prstGeom>
+                  </pic:spPr>
+                </pic:pic>
+              </a:graphicData>
+            </a:graphic>
+          </wp:inline>
+        </w:drawing>
       </w:r>
     </w:p>
     <w:p>
@@ -854,19 +1447,35 @@
         </w:rPr>
         <w:t>Go to the Frontera platform URL (</w:t>
       </w:r>
-      <w:r>
-        <w:rPr>
-          <w:color w:val="334155"/>
-          <w:szCs w:val="24"/>
-        </w:rPr>
-        <w:t>https://frontera-platform.vercel.app/</w:t>
-      </w:r>
-      <w:r>
-        <w:rPr>
-          <w:color w:val="334155"/>
-          <w:szCs w:val="24"/>
-        </w:rPr>
-        <w:t>) and create a</w:t>
+      <w:hyperlink r:id="rId9" w:history="1">
+        <w:r>
+          <w:rPr>
+            <w:rStyle w:val="Hyperlink"/>
+            <w:szCs w:val="24"/>
+          </w:rPr>
+          <w:t>https://frontera-platform.vercel.app/</w:t>
+        </w:r>
+      </w:hyperlink>
+      <w:r>
+        <w:rPr>
+          <w:color w:val="334155"/>
+          <w:szCs w:val="24"/>
+        </w:rPr>
+        <w:t>)</w:t>
+      </w:r>
+      <w:r>
+        <w:rPr>
+          <w:color w:val="334155"/>
+          <w:szCs w:val="24"/>
+        </w:rPr>
+        <w:t xml:space="preserve">, select “book a demo button” </w:t>
+      </w:r>
+      <w:r>
+        <w:rPr>
+          <w:color w:val="334155"/>
+          <w:szCs w:val="24"/>
+        </w:rPr>
+        <w:t>and create a</w:t>
       </w:r>
       <w:r>
         <w:rPr>
@@ -898,6 +1507,29 @@
         </w:rPr>
         <w:t>We will then validate and send you an invite to set up your user profile, linked to your company.</w:t>
       </w:r>
+      <w:r>
+        <w:rPr>
+          <w:color w:val="334155"/>
+          <w:szCs w:val="24"/>
+        </w:rPr>
+        <w:t xml:space="preserve"> (if you can email me direct </w:t>
+      </w:r>
+      <w:hyperlink r:id="rId10" w:history="1">
+        <w:r>
+          <w:rPr>
+            <w:rStyle w:val="Hyperlink"/>
+            <w:szCs w:val="24"/>
+          </w:rPr>
+          <w:t>deek.smith@gmail.com</w:t>
+        </w:r>
+      </w:hyperlink>
+      <w:r>
+        <w:rPr>
+          <w:color w:val="334155"/>
+          <w:szCs w:val="24"/>
+        </w:rPr>
+        <w:t>, I will make sure it is set up asap).</w:t>
+      </w:r>
     </w:p>
     <w:p>
       <w:pPr>
@@ -912,17 +1544,8 @@
           <w:color w:val="334155"/>
           <w:szCs w:val="24"/>
         </w:rPr>
-        <w:lastRenderedPageBreak/>
         <w:t xml:space="preserve"> </w:t>
       </w:r>
-    </w:p>
-    <w:p>
-      <w:pPr>
-        <w:spacing w:after="80"/>
-        <w:rPr>
-          <w:szCs w:val="24"/>
-        </w:rPr>
-      </w:pPr>
     </w:p>
     <w:p>
       <w:pPr>
@@ -1046,7 +1669,21 @@
           <w:color w:val="334155"/>
           <w:szCs w:val="24"/>
         </w:rPr>
-        <w:t>en The Product Strategy Development module</w:t>
+        <w:t xml:space="preserve">en </w:t>
+      </w:r>
+      <w:r>
+        <w:rPr>
+          <w:color w:val="334155"/>
+          <w:szCs w:val="24"/>
+        </w:rPr>
+        <w:t>t</w:t>
+      </w:r>
+      <w:r>
+        <w:rPr>
+          <w:color w:val="334155"/>
+          <w:szCs w:val="24"/>
+        </w:rPr>
+        <w:t>he Product Strategy Development module</w:t>
       </w:r>
     </w:p>
     <w:p>
@@ -1129,6 +1766,7 @@
         </w:rPr>
       </w:pPr>
       <w:r>
+        <w:lastRenderedPageBreak/>
         <w:t>Select Open Profile button under the “Personal Profile” card and complete the instructions.</w:t>
       </w:r>
     </w:p>
@@ -1180,6 +1818,7 @@
       <w:pPr>
         <w:spacing w:after="120"/>
         <w:rPr>
+          <w:color w:val="334155"/>
           <w:szCs w:val="24"/>
         </w:rPr>
       </w:pPr>
@@ -1189,6 +1828,30 @@
           <w:szCs w:val="24"/>
         </w:rPr>
         <w:t>Open the Product Strategy Development tool and begin working through it. The coach will guide you through several phases.</w:t>
+      </w:r>
+    </w:p>
+    <w:p>
+      <w:pPr>
+        <w:spacing w:after="120"/>
+        <w:rPr>
+          <w:color w:val="334155"/>
+          <w:szCs w:val="24"/>
+        </w:rPr>
+      </w:pPr>
+    </w:p>
+    <w:p>
+      <w:pPr>
+        <w:spacing w:after="120"/>
+        <w:rPr>
+          <w:szCs w:val="24"/>
+        </w:rPr>
+      </w:pPr>
+      <w:r>
+        <w:rPr>
+          <w:color w:val="334155"/>
+          <w:szCs w:val="24"/>
+        </w:rPr>
+        <w:t>For context this session is designed to coach the user through a structured and phased process to develop a Product strategy. It is supposed to be a multi-day and muti-interaction activity with coaching, reflection and iteration. As you are testing please feel free to either enter as much context as you want in the questions/ coaching, or use the AI suggestions for speed if quicker/ easier at any point.</w:t>
       </w:r>
     </w:p>
     <w:p>
@@ -1447,8 +2110,101 @@
           <w:color w:val="334155"/>
           <w:szCs w:val="24"/>
         </w:rPr>
+        <w:t>2. What stood out to you — positively or negatively?</w:t>
+      </w:r>
+    </w:p>
+    <w:p>
+      <w:pPr>
+        <w:spacing w:after="120"/>
+        <w:rPr>
+          <w:szCs w:val="24"/>
+        </w:rPr>
+      </w:pPr>
+      <w:r>
+        <w:rPr>
+          <w:color w:val="334155"/>
+          <w:szCs w:val="24"/>
+        </w:rPr>
+        <w:t>3. Was there anything you expected to find that wasn't there?</w:t>
+      </w:r>
+    </w:p>
+    <w:p>
+      <w:pPr>
+        <w:spacing w:after="120"/>
+        <w:rPr>
+          <w:szCs w:val="24"/>
+        </w:rPr>
+      </w:pPr>
+      <w:r>
+        <w:rPr>
+          <w:color w:val="334155"/>
+          <w:szCs w:val="24"/>
+        </w:rPr>
+        <w:t>4. Was there a point where you felt unsure what to do next?</w:t>
+      </w:r>
+    </w:p>
+    <w:p>
+      <w:pPr>
+        <w:spacing w:after="120"/>
+        <w:rPr>
+          <w:szCs w:val="24"/>
+        </w:rPr>
+      </w:pPr>
+      <w:r>
+        <w:rPr>
+          <w:color w:val="334155"/>
+          <w:szCs w:val="24"/>
+        </w:rPr>
+        <w:t>5. How would you describe what Frontera does to a colleague?</w:t>
+      </w:r>
+    </w:p>
+    <w:p>
+      <w:pPr>
+        <w:spacing w:after="120"/>
+        <w:rPr>
+          <w:color w:val="334155"/>
+          <w:szCs w:val="24"/>
+        </w:rPr>
+      </w:pPr>
+      <w:r>
+        <w:rPr>
+          <w:color w:val="334155"/>
+          <w:szCs w:val="24"/>
+        </w:rPr>
+        <w:t>6. Would you use this for real strategic work? Why or why not?</w:t>
+      </w:r>
+    </w:p>
+    <w:p>
+      <w:pPr>
+        <w:spacing w:after="120"/>
+        <w:rPr>
+          <w:color w:val="334155"/>
+          <w:szCs w:val="24"/>
+        </w:rPr>
+      </w:pPr>
+      <w:r>
+        <w:rPr>
+          <w:color w:val="334155"/>
+          <w:szCs w:val="24"/>
+        </w:rPr>
+        <w:t>7. What frustrated you?</w:t>
+      </w:r>
+    </w:p>
+    <w:p>
+      <w:pPr>
+        <w:spacing w:after="120"/>
+        <w:rPr>
+          <w:color w:val="334155"/>
+          <w:szCs w:val="24"/>
+        </w:rPr>
+      </w:pPr>
+      <w:r>
+        <w:rPr>
+          <w:color w:val="334155"/>
+          <w:szCs w:val="24"/>
+        </w:rPr>
         <w:lastRenderedPageBreak/>
-        <w:t>2. What stood out to you — positively or negatively?</w:t>
+        <w:t>8. What did you enjoy/ value in the experience?</w:t>
       </w:r>
     </w:p>
     <w:p>
@@ -1463,52 +2219,7 @@
           <w:color w:val="334155"/>
           <w:szCs w:val="24"/>
         </w:rPr>
-        <w:t>3. Was there anything you expected to find that wasn't there?</w:t>
-      </w:r>
-    </w:p>
-    <w:p>
-      <w:pPr>
-        <w:spacing w:after="120"/>
-        <w:rPr>
-          <w:szCs w:val="24"/>
-        </w:rPr>
-      </w:pPr>
-      <w:r>
-        <w:rPr>
-          <w:color w:val="334155"/>
-          <w:szCs w:val="24"/>
-        </w:rPr>
-        <w:t>4. Was there a point where you felt unsure what to do next?</w:t>
-      </w:r>
-    </w:p>
-    <w:p>
-      <w:pPr>
-        <w:spacing w:after="120"/>
-        <w:rPr>
-          <w:szCs w:val="24"/>
-        </w:rPr>
-      </w:pPr>
-      <w:r>
-        <w:rPr>
-          <w:color w:val="334155"/>
-          <w:szCs w:val="24"/>
-        </w:rPr>
-        <w:t>5. How would you describe what Frontera does to a colleague?</w:t>
-      </w:r>
-    </w:p>
-    <w:p>
-      <w:pPr>
-        <w:spacing w:after="120"/>
-        <w:rPr>
-          <w:szCs w:val="24"/>
-        </w:rPr>
-      </w:pPr>
-      <w:r>
-        <w:rPr>
-          <w:color w:val="334155"/>
-          <w:szCs w:val="24"/>
-        </w:rPr>
-        <w:t>6. Would you use this for real strategic work? Why or why not?</w:t>
+        <w:t>9. How would you describe the quality of the coaching and recommendations throughout the process</w:t>
       </w:r>
     </w:p>
     <w:p>
@@ -2380,15 +3091,7 @@
                 <w:color w:val="334155"/>
                 <w:szCs w:val="24"/>
               </w:rPr>
-              <w:t xml:space="preserve">Working through </w:t>
-            </w:r>
-            <w:r>
-              <w:rPr>
-                <w:color w:val="334155"/>
-                <w:szCs w:val="24"/>
-              </w:rPr>
-              <w:lastRenderedPageBreak/>
-              <w:t>Synthesis (if reached)</w:t>
+              <w:t>Working through Synthesis (if reached)</w:t>
             </w:r>
           </w:p>
         </w:tc>
@@ -2485,6 +3188,7 @@
           <w:sz w:val="22"/>
           <w:szCs w:val="22"/>
         </w:rPr>
+        <w:lastRenderedPageBreak/>
         <w:t>System Usability Scale (SUS)</w:t>
       </w:r>
     </w:p>
@@ -3381,7 +4085,99 @@
                 <w:color w:val="334155"/>
                 <w:szCs w:val="24"/>
               </w:rPr>
-              <w:t xml:space="preserve">I found the platform very </w:t>
+              <w:t>I found the platform very awkward to use</w:t>
+            </w:r>
+          </w:p>
+        </w:tc>
+        <w:tc>
+          <w:tcPr>
+            <w:tcW w:w="700" w:type="pct"/>
+          </w:tcPr>
+          <w:p>
+            <w:pPr>
+              <w:spacing w:before="40" w:after="40"/>
+            </w:pPr>
+          </w:p>
+        </w:tc>
+        <w:tc>
+          <w:tcPr>
+            <w:tcW w:w="700" w:type="pct"/>
+          </w:tcPr>
+          <w:p>
+            <w:pPr>
+              <w:spacing w:before="40" w:after="40"/>
+            </w:pPr>
+          </w:p>
+        </w:tc>
+        <w:tc>
+          <w:tcPr>
+            <w:tcW w:w="700" w:type="pct"/>
+          </w:tcPr>
+          <w:p>
+            <w:pPr>
+              <w:spacing w:before="40" w:after="40"/>
+            </w:pPr>
+          </w:p>
+        </w:tc>
+        <w:tc>
+          <w:tcPr>
+            <w:tcW w:w="700" w:type="pct"/>
+          </w:tcPr>
+          <w:p>
+            <w:pPr>
+              <w:spacing w:before="40" w:after="40"/>
+            </w:pPr>
+          </w:p>
+        </w:tc>
+        <w:tc>
+          <w:tcPr>
+            <w:tcW w:w="700" w:type="pct"/>
+          </w:tcPr>
+          <w:p>
+            <w:pPr>
+              <w:spacing w:before="40" w:after="40"/>
+            </w:pPr>
+          </w:p>
+        </w:tc>
+      </w:tr>
+      <w:tr>
+        <w:tc>
+          <w:tcPr>
+            <w:tcW w:w="700" w:type="pct"/>
+          </w:tcPr>
+          <w:p>
+            <w:pPr>
+              <w:spacing w:before="40" w:after="40"/>
+              <w:rPr>
+                <w:szCs w:val="24"/>
+              </w:rPr>
+            </w:pPr>
+            <w:r>
+              <w:rPr>
+                <w:color w:val="334155"/>
+                <w:szCs w:val="24"/>
+              </w:rPr>
+              <w:t>9</w:t>
+            </w:r>
+          </w:p>
+        </w:tc>
+        <w:tc>
+          <w:tcPr>
+            <w:tcW w:w="700" w:type="pct"/>
+          </w:tcPr>
+          <w:p>
+            <w:pPr>
+              <w:spacing w:before="40" w:after="40"/>
+              <w:rPr>
+                <w:szCs w:val="24"/>
+              </w:rPr>
+            </w:pPr>
+            <w:r>
+              <w:rPr>
+                <w:color w:val="334155"/>
+                <w:szCs w:val="24"/>
+              </w:rPr>
+              <w:t xml:space="preserve">I felt very confident </w:t>
             </w:r>
             <w:r>
               <w:rPr>
@@ -3389,99 +4185,7 @@
                 <w:szCs w:val="24"/>
               </w:rPr>
               <w:lastRenderedPageBreak/>
-              <w:t>awkward to use</w:t>
-            </w:r>
-          </w:p>
-        </w:tc>
-        <w:tc>
-          <w:tcPr>
-            <w:tcW w:w="700" w:type="pct"/>
-          </w:tcPr>
-          <w:p>
-            <w:pPr>
-              <w:spacing w:before="40" w:after="40"/>
-            </w:pPr>
-          </w:p>
-        </w:tc>
-        <w:tc>
-          <w:tcPr>
-            <w:tcW w:w="700" w:type="pct"/>
-          </w:tcPr>
-          <w:p>
-            <w:pPr>
-              <w:spacing w:before="40" w:after="40"/>
-            </w:pPr>
-          </w:p>
-        </w:tc>
-        <w:tc>
-          <w:tcPr>
-            <w:tcW w:w="700" w:type="pct"/>
-          </w:tcPr>
-          <w:p>
-            <w:pPr>
-              <w:spacing w:before="40" w:after="40"/>
-            </w:pPr>
-          </w:p>
-        </w:tc>
-        <w:tc>
-          <w:tcPr>
-            <w:tcW w:w="700" w:type="pct"/>
-          </w:tcPr>
-          <w:p>
-            <w:pPr>
-              <w:spacing w:before="40" w:after="40"/>
-            </w:pPr>
-          </w:p>
-        </w:tc>
-        <w:tc>
-          <w:tcPr>
-            <w:tcW w:w="700" w:type="pct"/>
-          </w:tcPr>
-          <w:p>
-            <w:pPr>
-              <w:spacing w:before="40" w:after="40"/>
-            </w:pPr>
-          </w:p>
-        </w:tc>
-      </w:tr>
-      <w:tr>
-        <w:tc>
-          <w:tcPr>
-            <w:tcW w:w="700" w:type="pct"/>
-          </w:tcPr>
-          <w:p>
-            <w:pPr>
-              <w:spacing w:before="40" w:after="40"/>
-              <w:rPr>
-                <w:szCs w:val="24"/>
-              </w:rPr>
-            </w:pPr>
-            <w:r>
-              <w:rPr>
-                <w:color w:val="334155"/>
-                <w:szCs w:val="24"/>
-              </w:rPr>
-              <w:t>9</w:t>
-            </w:r>
-          </w:p>
-        </w:tc>
-        <w:tc>
-          <w:tcPr>
-            <w:tcW w:w="700" w:type="pct"/>
-          </w:tcPr>
-          <w:p>
-            <w:pPr>
-              <w:spacing w:before="40" w:after="40"/>
-              <w:rPr>
-                <w:szCs w:val="24"/>
-              </w:rPr>
-            </w:pPr>
-            <w:r>
-              <w:rPr>
-                <w:color w:val="334155"/>
-                <w:szCs w:val="24"/>
-              </w:rPr>
-              <w:t>I felt very confident using the platform</w:t>
+              <w:t>using the platform</w:t>
             </w:r>
           </w:p>
         </w:tc>
@@ -4386,7 +5090,6 @@
           <w:color w:val="334155"/>
           <w:szCs w:val="24"/>
         </w:rPr>
-        <w:lastRenderedPageBreak/>
         <w:t>2. What was missing or disappointing?</w:t>
       </w:r>
     </w:p>
@@ -4449,6 +5152,7 @@
           <w:color w:val="334155"/>
           <w:szCs w:val="24"/>
         </w:rPr>
+        <w:lastRenderedPageBreak/>
         <w:t>0 — 1 — 2 — 3 — 4 — 5 — 6 — 7 — 8 — 9 — 10</w:t>
       </w:r>
     </w:p>
@@ -4660,7 +5364,25 @@
           <w:color w:val="334155"/>
           <w:szCs w:val="24"/>
         </w:rPr>
-        <w:t>Fill in during the session.</w:t>
+        <w:t xml:space="preserve">Fill in </w:t>
+      </w:r>
+      <w:r>
+        <w:rPr>
+          <w:i/>
+          <w:iCs/>
+          <w:color w:val="334155"/>
+          <w:szCs w:val="24"/>
+        </w:rPr>
+        <w:t>through session recording</w:t>
+      </w:r>
+      <w:r>
+        <w:rPr>
+          <w:i/>
+          <w:iCs/>
+          <w:color w:val="334155"/>
+          <w:szCs w:val="24"/>
+        </w:rPr>
+        <w:t>.</w:t>
       </w:r>
     </w:p>
     <w:p>
@@ -5255,7 +5977,6 @@
                 <w:color w:val="334155"/>
                 <w:szCs w:val="24"/>
               </w:rPr>
-              <w:lastRenderedPageBreak/>
               <w:t>Dashboard exploration</w:t>
             </w:r>
           </w:p>
@@ -5464,6 +6185,7 @@
                 <w:color w:val="334155"/>
                 <w:szCs w:val="24"/>
               </w:rPr>
+              <w:lastRenderedPageBreak/>
               <w:t>Strategic Bets</w:t>
             </w:r>
           </w:p>
@@ -5919,6 +6641,95 @@
     </w:lvl>
   </w:abstractNum>
   <w:abstractNum w:abstractNumId="3" w15:restartNumberingAfterBreak="0">
+    <w:nsid w:val="74B16C4E"/>
+    <w:multiLevelType w:val="hybridMultilevel"/>
+    <w:tmpl w:val="CDAA7454"/>
+    <w:lvl w:ilvl="0" w:tplc="0809000F">
+      <w:start w:val="1"/>
+      <w:numFmt w:val="decimal"/>
+      <w:lvlText w:val="%1."/>
+      <w:lvlJc w:val="left"/>
+      <w:pPr>
+        <w:ind w:left="720" w:hanging="360"/>
+      </w:pPr>
+      <w:rPr>
+        <w:rFonts w:hint="default"/>
+      </w:rPr>
+    </w:lvl>
+    <w:lvl w:ilvl="1" w:tplc="08090019" w:tentative="1">
+      <w:start w:val="1"/>
+      <w:numFmt w:val="lowerLetter"/>
+      <w:lvlText w:val="%2."/>
+      <w:lvlJc w:val="left"/>
+      <w:pPr>
+        <w:ind w:left="1440" w:hanging="360"/>
+      </w:pPr>
+    </w:lvl>
+    <w:lvl w:ilvl="2" w:tplc="0809001B" w:tentative="1">
+      <w:start w:val="1"/>
+      <w:numFmt w:val="lowerRoman"/>
+      <w:lvlText w:val="%3."/>
+      <w:lvlJc w:val="right"/>
+      <w:pPr>
+        <w:ind w:left="2160" w:hanging="180"/>
+      </w:pPr>
+    </w:lvl>
+    <w:lvl w:ilvl="3" w:tplc="0809000F" w:tentative="1">
+      <w:start w:val="1"/>
+      <w:numFmt w:val="decimal"/>
+      <w:lvlText w:val="%4."/>
+      <w:lvlJc w:val="left"/>
+      <w:pPr>
+        <w:ind w:left="2880" w:hanging="360"/>
+      </w:pPr>
+    </w:lvl>
+    <w:lvl w:ilvl="4" w:tplc="08090019" w:tentative="1">
+      <w:start w:val="1"/>
+      <w:numFmt w:val="lowerLetter"/>
+      <w:lvlText w:val="%5."/>
+      <w:lvlJc w:val="left"/>
+      <w:pPr>
+        <w:ind w:left="3600" w:hanging="360"/>
+      </w:pPr>
+    </w:lvl>
+    <w:lvl w:ilvl="5" w:tplc="0809001B" w:tentative="1">
+      <w:start w:val="1"/>
+      <w:numFmt w:val="lowerRoman"/>
+      <w:lvlText w:val="%6."/>
+      <w:lvlJc w:val="right"/>
+      <w:pPr>
+        <w:ind w:left="4320" w:hanging="180"/>
+      </w:pPr>
+    </w:lvl>
+    <w:lvl w:ilvl="6" w:tplc="0809000F" w:tentative="1">
+      <w:start w:val="1"/>
+      <w:numFmt w:val="decimal"/>
+      <w:lvlText w:val="%7."/>
+      <w:lvlJc w:val="left"/>
+      <w:pPr>
+        <w:ind w:left="5040" w:hanging="360"/>
+      </w:pPr>
+    </w:lvl>
+    <w:lvl w:ilvl="7" w:tplc="08090019" w:tentative="1">
+      <w:start w:val="1"/>
+      <w:numFmt w:val="lowerLetter"/>
+      <w:lvlText w:val="%8."/>
+      <w:lvlJc w:val="left"/>
+      <w:pPr>
+        <w:ind w:left="5760" w:hanging="360"/>
+      </w:pPr>
+    </w:lvl>
+    <w:lvl w:ilvl="8" w:tplc="0809001B" w:tentative="1">
+      <w:start w:val="1"/>
+      <w:numFmt w:val="lowerRoman"/>
+      <w:lvlText w:val="%9."/>
+      <w:lvlJc w:val="right"/>
+      <w:pPr>
+        <w:ind w:left="6480" w:hanging="180"/>
+      </w:pPr>
+    </w:lvl>
+  </w:abstractNum>
+  <w:abstractNum w:abstractNumId="4" w15:restartNumberingAfterBreak="0">
     <w:nsid w:val="76EB6E92"/>
     <w:multiLevelType w:val="hybridMultilevel"/>
     <w:tmpl w:val="B9127342"/>
@@ -6038,13 +6849,16 @@
     </w:lvlOverride>
   </w:num>
   <w:num w:numId="2" w16cid:durableId="1437292866">
-    <w:abstractNumId w:val="3"/>
+    <w:abstractNumId w:val="4"/>
   </w:num>
   <w:num w:numId="3" w16cid:durableId="1439333655">
     <w:abstractNumId w:val="0"/>
   </w:num>
   <w:num w:numId="4" w16cid:durableId="1283489441">
     <w:abstractNumId w:val="1"/>
+  </w:num>
+  <w:num w:numId="5" w16cid:durableId="252013507">
+    <w:abstractNumId w:val="3"/>
   </w:num>
 </w:numbering>
 </file>
@@ -6532,7 +7346,6 @@
   <w:style w:type="character" w:default="1" w:styleId="DefaultParagraphFont">
     <w:name w:val="Default Paragraph Font"/>
     <w:uiPriority w:val="1"/>
-    <w:semiHidden/>
     <w:unhideWhenUsed/>
   </w:style>
   <w:style w:type="table" w:default="1" w:styleId="TableNormal">

</xml_diff>